<commit_message>
Add English demo narration and update author identity
</commit_message>
<xml_diff>
--- a/submission/AlphaVault-Report-Draft.docx
+++ b/submission/AlphaVault-Report-Draft.docx
@@ -22,7 +22,7 @@
     </w:p>
     <w:p>
       <w:r>
-        <w:t>Student name: [To be supplied]    Student ID: [To be supplied]</w:t>
+        <w:t>Author: Du zhuotong</w:t>
       </w:r>
     </w:p>
     <w:p>
@@ -4131,7 +4131,7 @@
     </w:p>
     <w:p>
       <w:r>
-        <w:t>Fill in the student identity and reconcile this draft with the original rubric, page limit, deadline and demonstration duration. Review the recorded demonstration, confirm marker access to the private repository or submit the source archive, and complete explorer source verification if required. Before a live trading demonstration, the risk officer must refresh both mock market reports. If approval does not count toward transaction types, record one additional core method. The accompanying video separates local actions from public historical evidence. No audit or real-market return claim is included.</w:t>
+        <w:t>Reconcile this draft with the original rubric, page limit, deadline and demonstration duration. Review the recorded demonstration, confirm marker access to the private repository or submit the source archive, and complete explorer source verification if required. Before a live trading demonstration, the risk officer must refresh both mock market reports. If approval does not count toward transaction types, record one additional core method. The accompanying video separates local actions from public historical evidence. No audit or real-market return claim is included.</w:t>
       </w:r>
     </w:p>
     <w:sectPr>

</xml_diff>